<commit_message>
Ajustado de margenes en el template docx
</commit_message>
<xml_diff>
--- a/back/utils/templates/templateDocs.docx
+++ b/back/utils/templates/templateDocs.docx
@@ -110,7 +110,7 @@
         </w:tblCellMar>
       </w:tblPr>
       <w:tblGrid>
-        <w:gridCol w:w="14570"/>
+        <w:gridCol w:w="15394"/>
       </w:tblGrid>
       <w:tr>
         <w:trPr>
@@ -118,7 +118,7 @@
         </w:trPr>
         <w:tc>
           <w:tcPr>
-            <w:tcW w:w="14570" w:type="dxa"/>
+            <w:tcW w:w="15394" w:type="dxa"/>
             <w:tcBorders>
               <w:top w:val="single" w:sz="4" w:space="0" w:color="000000"/>
               <w:start w:val="single" w:sz="4" w:space="0" w:color="000000"/>
@@ -173,7 +173,7 @@
     </w:p>
     <w:tbl>
       <w:tblPr>
-        <w:tblW w:w="14568" w:type="dxa"/>
+        <w:tblW w:w="15384" w:type="dxa"/>
         <w:jc w:val="start"/>
         <w:tblInd w:w="-5" w:type="dxa"/>
         <w:tblLayout w:type="fixed"/>
@@ -186,15 +186,15 @@
       </w:tblPr>
       <w:tblGrid>
         <w:gridCol w:w="1044"/>
-        <w:gridCol w:w="2699"/>
-        <w:gridCol w:w="1536"/>
+        <w:gridCol w:w="2698"/>
+        <w:gridCol w:w="1537"/>
         <w:gridCol w:w="1345"/>
         <w:gridCol w:w="1257"/>
         <w:gridCol w:w="855"/>
         <w:gridCol w:w="838"/>
         <w:gridCol w:w="830"/>
         <w:gridCol w:w="1716"/>
-        <w:gridCol w:w="2448"/>
+        <w:gridCol w:w="3264"/>
       </w:tblGrid>
       <w:tr>
         <w:trPr/>
@@ -232,7 +232,7 @@
         </w:tc>
         <w:tc>
           <w:tcPr>
-            <w:tcW w:w="2699" w:type="dxa"/>
+            <w:tcW w:w="2698" w:type="dxa"/>
             <w:tcBorders>
               <w:top w:val="single" w:sz="4" w:space="0" w:color="000000"/>
               <w:start w:val="single" w:sz="4" w:space="0" w:color="000000"/>
@@ -264,7 +264,7 @@
         </w:tc>
         <w:tc>
           <w:tcPr>
-            <w:tcW w:w="1536" w:type="dxa"/>
+            <w:tcW w:w="1537" w:type="dxa"/>
             <w:tcBorders>
               <w:top w:val="single" w:sz="4" w:space="0" w:color="000000"/>
               <w:start w:val="single" w:sz="4" w:space="0" w:color="000000"/>
@@ -474,7 +474,7 @@
         </w:tc>
         <w:tc>
           <w:tcPr>
-            <w:tcW w:w="2448" w:type="dxa"/>
+            <w:tcW w:w="3264" w:type="dxa"/>
             <w:tcBorders>
               <w:top w:val="single" w:sz="4" w:space="0" w:color="000000"/>
               <w:start w:val="single" w:sz="4" w:space="0" w:color="000000"/>
@@ -537,7 +537,7 @@
         </w:tc>
         <w:tc>
           <w:tcPr>
-            <w:tcW w:w="2699" w:type="dxa"/>
+            <w:tcW w:w="2698" w:type="dxa"/>
             <w:tcBorders>
               <w:start w:val="single" w:sz="4" w:space="0" w:color="000000"/>
               <w:bottom w:val="single" w:sz="4" w:space="0" w:color="000000"/>
@@ -565,7 +565,7 @@
         </w:tc>
         <w:tc>
           <w:tcPr>
-            <w:tcW w:w="1536" w:type="dxa"/>
+            <w:tcW w:w="1537" w:type="dxa"/>
             <w:tcBorders>
               <w:start w:val="single" w:sz="4" w:space="0" w:color="000000"/>
               <w:bottom w:val="single" w:sz="4" w:space="0" w:color="000000"/>
@@ -733,7 +733,7 @@
         </w:tc>
         <w:tc>
           <w:tcPr>
-            <w:tcW w:w="2448" w:type="dxa"/>
+            <w:tcW w:w="3264" w:type="dxa"/>
             <w:tcBorders>
               <w:start w:val="single" w:sz="4" w:space="0" w:color="000000"/>
               <w:bottom w:val="single" w:sz="4" w:space="0" w:color="000000"/>
@@ -789,7 +789,7 @@
         </w:tc>
         <w:tc>
           <w:tcPr>
-            <w:tcW w:w="2699" w:type="dxa"/>
+            <w:tcW w:w="2698" w:type="dxa"/>
             <w:tcBorders>
               <w:start w:val="single" w:sz="4" w:space="0" w:color="000000"/>
               <w:bottom w:val="single" w:sz="4" w:space="0" w:color="000000"/>
@@ -814,7 +814,7 @@
         </w:tc>
         <w:tc>
           <w:tcPr>
-            <w:tcW w:w="1536" w:type="dxa"/>
+            <w:tcW w:w="1537" w:type="dxa"/>
             <w:tcBorders>
               <w:start w:val="single" w:sz="4" w:space="0" w:color="000000"/>
               <w:bottom w:val="single" w:sz="4" w:space="0" w:color="000000"/>
@@ -989,7 +989,7 @@
         </w:tc>
         <w:tc>
           <w:tcPr>
-            <w:tcW w:w="2448" w:type="dxa"/>
+            <w:tcW w:w="3264" w:type="dxa"/>
             <w:tcBorders>
               <w:start w:val="single" w:sz="4" w:space="0" w:color="000000"/>
               <w:bottom w:val="single" w:sz="4" w:space="0" w:color="000000"/>
@@ -1048,31 +1048,31 @@
         </w:tc>
         <w:tc>
           <w:tcPr>
-            <w:tcW w:w="2699" w:type="dxa"/>
-            <w:tcBorders>
-              <w:start w:val="single" w:sz="4" w:space="0" w:color="000000"/>
-              <w:bottom w:val="single" w:sz="4" w:space="0" w:color="000000"/>
-            </w:tcBorders>
-          </w:tcPr>
-          <w:p>
-            <w:pPr>
-              <w:pStyle w:val="TableContents"/>
-              <w:bidi w:val="0"/>
-              <w:jc w:val="start"/>
-              <w:rPr>
-                <w:rFonts w:ascii="Times New Roman" w:hAnsi="Times New Roman"/>
-              </w:rPr>
-            </w:pPr>
-            <w:r>
-              <w:rPr>
-                <w:rFonts w:ascii="Times New Roman" w:hAnsi="Times New Roman"/>
-              </w:rPr>
-            </w:r>
-          </w:p>
-        </w:tc>
-        <w:tc>
-          <w:tcPr>
-            <w:tcW w:w="1536" w:type="dxa"/>
+            <w:tcW w:w="2698" w:type="dxa"/>
+            <w:tcBorders>
+              <w:start w:val="single" w:sz="4" w:space="0" w:color="000000"/>
+              <w:bottom w:val="single" w:sz="4" w:space="0" w:color="000000"/>
+            </w:tcBorders>
+          </w:tcPr>
+          <w:p>
+            <w:pPr>
+              <w:pStyle w:val="TableContents"/>
+              <w:bidi w:val="0"/>
+              <w:jc w:val="start"/>
+              <w:rPr>
+                <w:rFonts w:ascii="Times New Roman" w:hAnsi="Times New Roman"/>
+              </w:rPr>
+            </w:pPr>
+            <w:r>
+              <w:rPr>
+                <w:rFonts w:ascii="Times New Roman" w:hAnsi="Times New Roman"/>
+              </w:rPr>
+            </w:r>
+          </w:p>
+        </w:tc>
+        <w:tc>
+          <w:tcPr>
+            <w:tcW w:w="1537" w:type="dxa"/>
             <w:tcBorders>
               <w:start w:val="single" w:sz="4" w:space="0" w:color="000000"/>
               <w:bottom w:val="single" w:sz="4" w:space="0" w:color="000000"/>
@@ -1240,7 +1240,7 @@
         </w:tc>
         <w:tc>
           <w:tcPr>
-            <w:tcW w:w="2448" w:type="dxa"/>
+            <w:tcW w:w="3264" w:type="dxa"/>
             <w:tcBorders>
               <w:start w:val="single" w:sz="4" w:space="0" w:color="000000"/>
               <w:bottom w:val="single" w:sz="4" w:space="0" w:color="000000"/>
@@ -1306,8 +1306,8 @@
     </w:p>
     <w:sectPr>
       <w:type w:val="nextPage"/>
-      <w:pgSz w:orient="landscape" w:w="16838" w:h="11906"/>
-      <w:pgMar w:left="1134" w:right="1134" w:gutter="0" w:header="0" w:top="1134" w:footer="0" w:bottom="1134"/>
+      <w:pgSz w:orient="landscape" w:w="16834" w:h="11909"/>
+      <w:pgMar w:left="720" w:right="720" w:gutter="0" w:header="0" w:top="72" w:footer="0" w:bottom="1134"/>
       <w:pgNumType w:fmt="decimal"/>
       <w:formProt w:val="false"/>
       <w:textDirection w:val="lrTb"/>

</xml_diff>